<commit_message>
docs: update api-contracts, architecture, memoire v6 docx, build v6 script, docker-compose
</commit_message>
<xml_diff>
--- a/docs/rapport-stage/memoire-stage-andre-yoann-kenmogne-v6.docx
+++ b/docs/rapport-stage/memoire-stage-andre-yoann-kenmogne-v6.docx
@@ -4411,7 +4411,7 @@
           <w:rFonts w:ascii="Times New Roman" w:hAnsi="Times New Roman" w:cs="Times New Roman"/>
           <w:sz w:val="24"/>
         </w:rPr>
-        <w:t>Ce premier chapitre pose les bases contextuelles, réglementaires, opérationnelles et économiques du projet. Il décrit d'une part la BICEC et les spécificités de son département Étude et Développement, moteur de l'innovation logicielle au sein de l'établissement. D'autre part, il analyse la forte pression concurrentielle induite par les services de Mobile Money sur les parcours traditionnels d'acquisition client. Cette double analyse met en lumière la complexité réglementaire imposée par le règlement COBAC R-2023/01 relatif aux diligences KYC et la Loi camerounaise n° 2024/017 de protection des données. La confrontation de ces contraintes permet de formuler une problématique d'ingénierie robuste et d'esquisser les réponses apportées par le pipeline numérique souverain BICEC VeriPass, validé sous un modèle économique de haute rentabilité.</w:t>
+        <w:t>Ce premier chapitre pose les bases contextuelles, réglementaires, opérationnelles et économiques du projet. Il décrit d'une part la BICEC et les spécificités de son département Étude et Développement, moteur de l'innovation logicielle au sein de l'établissement. D'autre part, il analyse la forte pression concurrentielle induite par les services de Mobile Money sur les parcours traditionnels d'acquisition client. Cette double analyse met en lumière la complexité réglementaire imposée par le règlement COBAC R-2023/01 relatif aux diligences KYC et la Loi camerounaise n° 2024/017 de protection des données. La confrontation de ces contraintes permet de formuler une problématique d'ingénierie robuste et d'esquisser les réponses souveraines apportées par le pipeline numérique autonome BICEC VeriPass, validé sous un modèle économique de haute rentabilité.</w:t>
       </w:r>
     </w:p>
     <w:p>
@@ -4456,7 +4456,7 @@
           <w:rFonts w:ascii="Times New Roman" w:hAnsi="Times New Roman" w:cs="Times New Roman"/>
           <w:sz w:val="24"/>
         </w:rPr>
-        <w:t>Le stage de fin d'études d'ingénieur s'est déroulé au sein du Département Étude et Développement à Douala, sous l'encadrement industriel de M. Jackson Parfait KOMBE LELE, Chef de Département. Ce département joue le rôle stratégique de incubateur de solutions internes, orientant la transition RegTech de la banque face aux défis du marché financier. La mission confiée consistait en la conception et le développement de BICEC VeriPass, un écosystème intelligent et souverain d'acquisition client destiné à automatiser la conformité réglementaire KYC (Know Your Customer) à travers l'intégration de technologies avancées d'OCR, de liveness detection et de face matching. Ce projet de cinq mois, du 19 janvier 2026 au 18 juin 2026, s'inscrit directement au cœur de la stratégie d'innovation de l'établissement.</w:t>
+        <w:t>Le stage de fin d'études d'ingénieur s'est déroulé au sein du Département Étude et Développement à Douala, sous l'encadrement industriel de M. Jackson Parfait KOMBE LELE, Chef de Département. Ce département joue le rôle stratégique d'incubateur de solutions internes, orientant la transition RegTech de la banque face aux défis du marché financier. La mission confiée consistait en la conception et le développement de BICEC VeriPass, un écosystème intelligent et souverain d'acquisition client destiné à automatiser la conformité réglementaire KYC (Know Your Customer) à travers l'intégration de technologies avancées d'OCR, de liveness detection et de face matching. Ce projet de cinq mois, du 19 janvier 2026 au 18 juin 2026, s'inscrit directement au cœur de la stratégie d'innovation de l'établissement.</w:t>
       </w:r>
     </w:p>
     <w:p>
@@ -5158,7 +5158,7 @@
           <w:rFonts w:ascii="Times New Roman" w:hAnsi="Times New Roman" w:cs="Times New Roman"/>
           <w:sz w:val="24"/>
         </w:rPr>
-        <w:t>Le processus manuel actuel de la BICEC présente quatre limites opérationnelles majeures. La première est la friction physique inhérente au déplacement : le client doit se déplacer en agence pour signer des formulaires physiques et fournir des photocopies de ses pièces d'identité. La deuxième limite concerne le taux d'erreur élevé : environ 30% à 40% des dossiers papier soumis sont incomplets ou comportent des fautes de frappe commises par les chargés de clientèle lors de la recopie manuelle des documents d'identité dans le système bancaire central Sopra Banking Amplitude. La troisième limite concerne la sécurité et le risque de fraude : sans outils biométriques locaux, les agents peinent à identifier visuellement les faux papiers ou les usurpations faciale complexes.</w:t>
+        <w:t>Le processus manuel actuel de la BICEC présente quatre limites opérationnelles majeures. La première est la friction physique inhérente au déplacement : le client doit se déplacer en agence pour signer des formulaires physiques et fournir des photocopies de ses pièces d'identité. La deuxième limite concerne le taux d'erreur élevé : environ 30% à 40% des dossiers papier soumis sont incomplets ou comportent des fautes de frappe commises par les chargés de clientèle lors de la recopie manuelle des documents d'identité dans le système bancaire. La troisième limite concerne la sécurité et le risque de fraude : sans outils biométriques locaux, les agents peinent à identifier visuellement les faux papiers ou les usurpations faciale complexes.</w:t>
       </w:r>
     </w:p>
     <w:p>
@@ -5830,7 +5830,7 @@
           <w:rFonts w:ascii="Times New Roman" w:hAnsi="Times New Roman" w:cs="Times New Roman"/>
           <w:sz w:val="24"/>
         </w:rPr>
-        <w:t>Le principe directeur est celui de l'automatisation contrôlée (Human-in-the-Loop) : les moteurs d'intelligence artificielle (PaddleOCR pour l'extraction rapide, GLM-OCR pour les factures non structurées, DeepFace et MiniFASNet pour la biométrie et la vivacité) effectuent les contrôles fastidieux et calculent un score de confiance global pour pré-remplir les données, mais l'agent conserve l'entière responsabilité de la validation finale et de l'activation du compte. Ce choix préserve la responsabilité civile de la banque tout en éliminant 80% de sa charge administrative de saisie.</w:t>
+        <w:t>Le principe directeur est celui de l'automatisation contrôlée (Human-in-the-Loop) : les moteurs d'intelligence artificielle (PaddleOCR pour l'extraction rapide, GLM-OCR pour les factures non structurées, DeepFace et MiniFASNet pour la biométrie et la vivacité) effectuent les contrôles fastidieux et calculent un score de confiance global pour pré-remplir les données, mais l'agent conserve l'entière responsabilité de la validation finale et de l'activation du compte. VeriPass agit ainsi comme un puissant garde barrière d'authentification et de conformité KYC, autorisant les utilisateurs validés à accéder aux applications bancaires BICEC via des redirections applicatives sécurisées (deep-linking), tout en maintenant hors de son périmètre l'intégration directe ou le provisionnement dans les bases transactionnelles Amplitude, délimitées comme hors scope pour préserver l'intégrité du Core Banking.</w:t>
       </w:r>
     </w:p>
     <w:p>
@@ -8973,7 +8973,7 @@
           <w:rFonts w:ascii="Times New Roman" w:hAnsi="Times New Roman" w:cs="Times New Roman"/>
           <w:sz w:val="24"/>
         </w:rPr>
-        <w:t>Le périmètre fonctionnel du MVP couvre le parcours client mobile (authentification par mot de passe à usage unique OTP, capture de la CNI recto/verso, liveness challenge, saisie de l'adresse avec GPS ou facture ENEO/CAMWATER, consentement Loi n° 2024/017 et signature tactile), la file d'attente de validation des agents de conformité, et la passerelle technique simulée avec Sopra Banking Amplitude. De façon stratégique, pour limiter l'abandon client pendant la phase de validation administrative (état RESTRICTED_ACCESS), l'application mobile intègre des démonstrations de fonctionnalités bancaires adaptées au statut d'accès du compte (Plan Premium/Standard, Everyday Needs, Cards management et linked accounts). Ces modules engagent l'utilisateur et intègrent un Single Sign-On (SSO) deep-link vers l'application de micro-crédit Bi-Cresco.</w:t>
+        <w:t>Le périmètre fonctionnel du MVP couvre le parcours client mobile (authentification par mot de passe à usage unique OTP, capture de la CNI recto/verso, liveness challenge, saisie de l'adresse avec GPS ou facture ENEO/CAMWATER, consentement Loi n° 2024/017 et signature tactile), la file d'attente de validation des agents de conformité, et la passerelle technique vers les applications cibles de la BICEC. De façon stratégique, pour limiter l'abandon client pendant la phase de validation administrative (état RESTRICTED), l'application mobile intègre des démonstrations de fonctionnalités bancaires adaptées au statut d'accès du compte (Plan Premium/Standard, Everyday Needs, Cards management et linked accounts). Ces modules engagent l'utilisateur et intègrent un Single Sign-On (SSO) deep-link vers l'application de micro-crédit Bi-Cresco.</w:t>
       </w:r>
     </w:p>
     <w:p>
@@ -9660,7 +9660,7 @@
           <w:rFonts w:ascii="Times New Roman" w:hAnsi="Times New Roman" w:cs="Times New Roman"/>
           <w:sz w:val="24"/>
         </w:rPr>
-        <w:t>Le pipeline traite plusieurs données hautement sensibles. Pour chaque utilisateur, il collecte : (1) l'identité déclarative civile ; (2) les photos haute-résolution de la CNI recto/verso (ou Passeport) ; (3) la capture du selfie biométrique avec vidéo de liveness active ; (4) la facture ENEO ou CAMWATER comme preuve de domicile ; (5) l'attestation NIU fiscale ; (6) les consentements Loi n° 2024/017 ; (7) la signature sur écran tactile et les adresses IP avec horodatage pour l'audit trail.</w:t>
+        <w:t>Le pipeline traite plusieurs données hautement sensibles. Pour chaque utilisateur, il collecte : (1) l'identité déclarative civile ; (2) les photos haute-résolution de la CNI recto/verso ; (3) la capture du selfie biométrique avec vidéo de liveness active ; (4) la facture ENEO ou CAMWATER comme preuve de domicile ; (5) l'attestation NIU fiscale ; (6) les consentements Loi n° 2024/017 ; (7) la signature sur écran tactile et les adresses IP avec horodatage pour l'audit trail.</w:t>
       </w:r>
     </w:p>
     <w:p>
@@ -9793,9 +9793,23 @@
       <w:r>
         <w:rPr>
           <w:rFonts w:ascii="Times New Roman" w:hAnsi="Times New Roman" w:cs="Times New Roman"/>
-          <w:sz w:val="24"/>
-        </w:rPr>
-        <w:t>Les exigences fonctionnelles (FR1 à FR19) cadrent précisément les flux applicatifs du système : authentification OTP, capture guidée, liveness challenge, validation locale du format de Numéro d'Identifiant Unique (NIU) via regex (^[A-Z][0-9]{12}[A-Z]$) et clé de contrôle algorithmique Modulo 23/26, consentement Loi n° 2024/017, signature tactile, file de validation assistée, et activation du compte.</w:t>
+        </w:rPr>
+        <w:t>Les exigences fonctionnelles (FR1 à FR19) cadrent précisément les flux applicatifs du système : authentification OTP, capture guidée, liveness challenge, validation locale du format de Numéro d'Identifiant Unique (NIU) via regex (^[A-Z][0-9]{12}[A-Z]$) et clé de contrôle algorithmique Modulo 23/26, consentement Loi n° 2024/017, signature tactile, file de validation assistée par agent KYC, et activation du dossier. Pour la conformité de modélisation, le pipeline intègre un simulateur d'Identifiant Bancaire Unique (IBU) basé sur la norme ISO 17442 (CM + segment BICEC 00001 + identifiant unique + clé de contrôle calculée selon l'algorithme Modulo 97-10 : Cle = 98 : (Number % 97)), permettant un développement et un test réalistes des interfaces. De plus, un mécanisme de sécurité robuste bloque l'accès (status LOCKED_LIVENESS) après 3 échecs consécutifs au liveness challenge pour éviter les attaques de présentation par brute force.</w:t>
+      </w:r>
+    </w:p>
+    <w:p>
+      <w:pPr>
+        <w:pStyle w:val="Heading2"/>
+        <w:spacing w:line="360" w:lineRule="auto" w:after="120"/>
+      </w:pPr>
+      <w:r>
+        <w:rPr>
+          <w:rFonts w:ascii="Times New Roman" w:hAnsi="Times New Roman" w:cs="Times New Roman"/>
+          <w:b/>
+          <w:color w:val="1F3A5F"/>
+          <w:sz w:val="28"/>
+        </w:rPr>
+        <w:t>2.7 Exigences non fonctionnelles</w:t>
       </w:r>
     </w:p>
     <w:p>
@@ -9808,38 +9822,9 @@
       <w:r>
         <w:rPr>
           <w:rFonts w:ascii="Times New Roman" w:hAnsi="Times New Roman" w:cs="Times New Roman"/>
-        </w:rPr>
-        <w:t>Pour la conformité réglementaire BEAC, le pipeline intègre également un simulateur d'Identifiant Bancaire Unique (IBU) basé sur la norme ISO 17442 (CM + segment BICEC 00001 + identifiant unique + clé de contrôle calculée selon l'algorithme Modulo 97-10 : Cle = 98 : (Number % 97)), permettant un développement et un test réalistes avant l'intégration finale de l'API BEAC. De plus, un mécanisme de sécurité robuste bloque l'accès après 3 échecs consécutifs au liveness challenge pour éviter les attaques de présentation par brute force.</w:t>
-      </w:r>
-    </w:p>
-    <w:p>
-      <w:pPr>
-        <w:pStyle w:val="Heading2"/>
-        <w:spacing w:line="360" w:lineRule="auto" w:after="120"/>
-      </w:pPr>
-      <w:r>
-        <w:rPr>
-          <w:rFonts w:ascii="Times New Roman" w:hAnsi="Times New Roman" w:cs="Times New Roman"/>
-          <w:b/>
-          <w:color w:val="1F3A5F"/>
-          <w:sz w:val="28"/>
-        </w:rPr>
-        <w:t>2.7 Exigences non fonctionnelles</w:t>
-      </w:r>
-    </w:p>
-    <w:p>
-      <w:pPr>
-        <w:pStyle w:val="MemoireBody"/>
-        <w:spacing w:line="360" w:lineRule="auto" w:after="120"/>
-        <w:ind w:firstLine="720"/>
-        <w:jc w:val="both"/>
-      </w:pPr>
-      <w:r>
-        <w:rPr>
-          <w:rFonts w:ascii="Times New Roman" w:hAnsi="Times New Roman" w:cs="Times New Roman"/>
           <w:sz w:val="24"/>
         </w:rPr>
-        <w:t>Les exigences non fonctionnelles (NFR1 à NFR14) imposent des critères de performance et de volume stricts. L'inférence locale de l'IA (OCR et biométrie) doit s'exécuter en moins de 15 secondes pour garantir un parcours total fluide. Pour valider scientifiquement ces moteurs, le projet s'appuie sur la constitution progressive d'un dataset d'entraînement local anonymisé (conformément aux principes de minimisation de la Loi n° 2024/017) : un jeu de données de 5 000 spécimens de CNI camerounaises pour le fine-tuning de PaddleOCR, et un jeu de test de 300 à 500 paires de visages pour l'évaluation de la similarité DeepFace (FAR &lt; 2%). La sécurité au repos impose le chiffrement AES-256 de tous les fichiers originaux sur le volume de stockage Docker centralisé.</w:t>
+        <w:t>Les exigences non fonctionnelles (NFR11 à NFR16 selon la normalisation de conduite de projet) imposent des critères de performance et de volume stricts. L'inférence locale de l'IA (OCR et biométrie) doit s'exécuter en moins de 15 secondes pour garantir un parcours total fluide. Pour valider scientifiquement ces moteurs, le projet s'appuie sur la constitution progressive d'un dataset d'entraînement local anonymisé (conformément aux principes de minimisation de la Loi n° 2024/017) : un jeu de données de 5 000 spécimens de CNI camerounaises pour le fine-tuning de PaddleOCR (NFR11), et un jeu de test de 300 à 500 paires de visages pour l'évaluation de la similarité DeepFace (NFR12, FAR &lt; 2%). La sécurité au repos impose le chiffrement AES-256 de tous les fichiers originaux sur le volume de stockage Docker centralisé.</w:t>
       </w:r>
     </w:p>
     <w:p>
@@ -10189,15 +10174,8 @@
             <w:vAlign w:val="top"/>
           </w:tcPr>
           <w:p>
-            <w:pPr>
-              <w:spacing w:line="240" w:lineRule="auto" w:after="0"/>
-            </w:pPr>
-            <w:r>
-              <w:rPr>
-                <w:rFonts w:ascii="Times New Roman" w:hAnsi="Times New Roman" w:cs="Times New Roman"/>
-                <w:sz w:val="18"/>
-              </w:rPr>
-              <w:t>Dataset de 5 000 images de CNI anonymisées (ground truth)</w:t>
+            <w:r>
+              <w:t>Dataset de 5 000 CNI anonymisées (NFR11 : ground truth)</w:t>
             </w:r>
           </w:p>
         </w:tc>
@@ -10269,15 +10247,8 @@
             <w:vAlign w:val="top"/>
           </w:tcPr>
           <w:p>
-            <w:pPr>
-              <w:spacing w:line="240" w:lineRule="auto" w:after="0"/>
-            </w:pPr>
-            <w:r>
-              <w:rPr>
-                <w:rFonts w:ascii="Times New Roman" w:hAnsi="Times New Roman" w:cs="Times New Roman"/>
-                <w:sz w:val="18"/>
-              </w:rPr>
-              <w:t>Reconnaissance faciale à 98.5% (FAR &lt; 2%)</w:t>
+            <w:r>
+              <w:t>Reconnaissance faciale à 98.5% (NFR12 : FAR &lt; 2%)</w:t>
             </w:r>
           </w:p>
         </w:tc>
@@ -10516,7 +10487,7 @@
           <w:rFonts w:ascii="Times New Roman" w:hAnsi="Times New Roman" w:cs="Times New Roman"/>
           <w:sz w:val="24"/>
         </w:rPr>
-        <w:t>Cette agilité garantit une rapidité de développement et permet d'intégrer les retours continus des encadreurs de la BICEC. Les livrables techniques (contrats API FastAPI, modèles relationnels PostgreSQL, PWA, back-office, logs de sécurité, proofs d'exécution) sont produits par petits incréments testés localement sous le budget de ressources matérielles contraint (RAM de la machine hôte limitée à 16 Go, WSL 2 plafonné à 8 Go de RAM), assurant la résilience et la viabilité de la solution avant sa démonstration finale.</w:t>
+        <w:t>Cette agilité garantit une rapidité de développement et permet d'intégrer les retours continus des encadreurs de la BICEC. Les livrables techniques (contrats API FastAPI, modèles relationnels PostgreSQL, PWA React/Vite, back-office, logs de sécurité, proofs d'exécution) sont produits par petits incréments testés localement sous le budget de ressources matérielles contraint (RAM de la machine hôte limitée à 16 Go, WSL 2 plafonné à 8 Go de RAM), assurant la résilience et la viabilité de la solution avant sa démonstration finale.</w:t>
       </w:r>
     </w:p>
     <w:p>
@@ -10855,7 +10826,7 @@
                 <w:rFonts w:ascii="Times New Roman" w:hAnsi="Times New Roman" w:cs="Times New Roman"/>
                 <w:sz w:val="18"/>
               </w:rPr>
-              <w:t>Backend FastAPI, PWA client, local OCR</w:t>
+              <w:t>Backend FastAPI, PWA React/Vite, local OCR</w:t>
             </w:r>
           </w:p>
         </w:tc>
@@ -11067,7 +11038,7 @@
                 <w:rFonts w:ascii="Times New Roman" w:hAnsi="Times New Roman" w:cs="Times New Roman"/>
                 <w:sz w:val="18"/>
               </w:rPr>
-              <w:t>Intégration Amplitude, DGI, analytics</w:t>
+              <w:t>SSO link, product discovery, notifications</w:t>
             </w:r>
           </w:p>
         </w:tc>
@@ -11093,7 +11064,7 @@
                 <w:rFonts w:ascii="Times New Roman" w:hAnsi="Times New Roman" w:cs="Times New Roman"/>
                 <w:sz w:val="18"/>
               </w:rPr>
-              <w:t>Indisponibilité API DGI en production</w:t>
+              <w:t>Bugs d'IndexedDB lors des délestages</w:t>
             </w:r>
           </w:p>
         </w:tc>
@@ -11119,7 +11090,7 @@
                 <w:rFonts w:ascii="Times New Roman" w:hAnsi="Times New Roman" w:cs="Times New Roman"/>
                 <w:sz w:val="18"/>
               </w:rPr>
-              <w:t>Ateliers techniques avec l'équipe Core Banking</w:t>
+              <w:t>Ateliers d'intégration PWA avec équipes client</w:t>
             </w:r>
           </w:p>
         </w:tc>

</xml_diff>